<commit_message>
- release file updated
</commit_message>
<xml_diff>
--- a/docs/MEDIUM_ARTICLE.docx
+++ b/docs/MEDIUM_ARTICLE.docx
@@ -119,7 +119,7 @@
       <w:r>
         <w:t xml:space="preserve">It's free and open source under the MIT license: 👉 </w:t>
       </w:r>
-      <w:hyperlink w:history="1" r:id="rIdknwf3dbyos0vw7qfk37d1">
+      <w:hyperlink w:history="1" r:id="rIdlfo4ek9hr85h6qtjqpjyj">
         <w:r>
           <w:rPr>
             <w:rStyle w:val="Hyperlink"/>
@@ -703,7 +703,7 @@
       <w:r>
         <w:t xml:space="preserve">Scanned documents are just pictures of text: you can't search them or copy from them. The OCR tool renders each page, recognises the text with </w:t>
       </w:r>
-      <w:hyperlink w:history="1" r:id="rIdczzqjw9te2yhzqv63foeq">
+      <w:hyperlink w:history="1" r:id="rIdi69sktc8fg14vkmf_kggg">
         <w:r>
           <w:rPr>
             <w:rStyle w:val="Hyperlink"/>
@@ -1040,7 +1040,7 @@
       <w:r>
         <w:t xml:space="preserve">DocCraft is built with </w:t>
       </w:r>
-      <w:hyperlink w:history="1" r:id="rIdw4zn4ucnwd96ogvrweykb">
+      <w:hyperlink w:history="1" r:id="rIdqtck-wxazuirj7adg4v1o">
         <w:r>
           <w:rPr>
             <w:rStyle w:val="Hyperlink"/>
@@ -1100,7 +1100,7 @@
       <w:r>
         <w:t xml:space="preserve"> PDF manipulation with </w:t>
       </w:r>
-      <w:hyperlink w:history="1" r:id="rIdhtvskcue3hj7awhpsytfd">
+      <w:hyperlink w:history="1" r:id="rId3z9gncllnim27bpeuisup">
         <w:r>
           <w:rPr>
             <w:rStyle w:val="Hyperlink"/>
@@ -1111,7 +1111,7 @@
       <w:r>
         <w:t xml:space="preserve"> runs in a Web Worker; text extraction and page rendering use Mozilla's </w:t>
       </w:r>
-      <w:hyperlink w:history="1" r:id="rId59rqx5k_opaaocjp91rb0">
+      <w:hyperlink w:history="1" r:id="rIdmodr1mcz-sxm3qqwbhjvd">
         <w:r>
           <w:rPr>
             <w:rStyle w:val="Hyperlink"/>
@@ -1122,7 +1122,7 @@
       <w:r>
         <w:t xml:space="preserve">; compression runs natively in Rust with </w:t>
       </w:r>
-      <w:hyperlink w:history="1" r:id="rId_vlmkqlhanfry22rdyyav">
+      <w:hyperlink w:history="1" r:id="rIdsl9evfqe3v8j7yuu7hhul">
         <w:r>
           <w:rPr>
             <w:rStyle w:val="Hyperlink"/>
@@ -1133,7 +1133,7 @@
       <w:r>
         <w:t xml:space="preserve"> and the </w:t>
       </w:r>
-      <w:hyperlink w:history="1" r:id="rIdkowequnlzmqzxxfkzrmcv">
+      <w:hyperlink w:history="1" r:id="rIdun40ah8-iuqvvljsm209g">
         <w:r>
           <w:rPr>
             <w:rStyle w:val="Hyperlink"/>
@@ -1228,7 +1228,7 @@
       <w:r>
         <w:t xml:space="preserve">The repository includes an </w:t>
       </w:r>
-      <w:hyperlink w:history="1" r:id="rId9b79otgu8sbvterdqmdsr">
+      <w:hyperlink w:history="1" r:id="rIdhidyeaxpkiugidtttbnxj">
         <w:r>
           <w:rPr>
             <w:rStyle w:val="Hyperlink"/>
@@ -1239,7 +1239,7 @@
       <w:r>
         <w:t xml:space="preserve"> with diagrams and a </w:t>
       </w:r>
-      <w:hyperlink w:history="1" r:id="rIdk4aaihffgat4ik2qmklb9">
+      <w:hyperlink w:history="1" r:id="rIdkku-qogeddn2xjvc8lhwc">
         <w:r>
           <w:rPr>
             <w:rStyle w:val="Hyperlink"/>
@@ -1376,30 +1376,18 @@
           <w:numId w:val="3"/>
         </w:numPr>
       </w:pPr>
-      <w:r>
-        <w:t xml:space="preserve">Go to the </w:t>
-      </w:r>
-      <w:hyperlink w:history="1" r:id="rIduvzrr86j3ybfyzo-gwlcr">
+      <w:hyperlink w:history="1" r:id="rIdto0cbx_qufu2ecige88_-">
         <w:r>
           <w:rPr>
             <w:rStyle w:val="Hyperlink"/>
             <w:b/>
             <w:bCs/>
           </w:rPr>
-          <w:t xml:space="preserve">Releases page</w:t>
+          <w:t xml:space="preserve">Download DocCraft for Windows</w:t>
         </w:r>
       </w:hyperlink>
       <w:r>
-        <w:t xml:space="preserve"> and download </w:t>
-      </w:r>
-      <w:r>
-        <w:rPr>
-          <w:rFonts w:ascii="Consolas" w:cs="Consolas" w:eastAsia="Consolas" w:hAnsi="Consolas"/>
-        </w:rPr>
-        <w:t xml:space="preserve">DocCraft_&lt;version&gt;_x64-setup.exe</w:t>
-      </w:r>
-      <w:r>
-        <w:t xml:space="preserve">.</w:t>
+        <w:t xml:space="preserve"> (about 4 MB, always the latest version).</w:t>
       </w:r>
     </w:p>
     <w:p>
@@ -1545,7 +1533,7 @@
       <w:r>
         <w:t xml:space="preserve"> if you find it useful: </w:t>
       </w:r>
-      <w:hyperlink w:history="1" r:id="rIdyolmaplnges9lnbeeo8k3">
+      <w:hyperlink w:history="1" r:id="rIdc84uiumdklkr9pdopzs_v">
         <w:r>
           <w:rPr>
             <w:rStyle w:val="Hyperlink"/>
@@ -1597,7 +1585,7 @@
       <w:r>
         <w:t xml:space="preserve">: start with the </w:t>
       </w:r>
-      <w:hyperlink w:history="1" r:id="rIddluur2fuyb49-1ir9vs0m">
+      <w:hyperlink w:history="1" r:id="rIdypm5qnemb9_h3brxgva_u">
         <w:r>
           <w:rPr>
             <w:rStyle w:val="Hyperlink"/>

</xml_diff>